<commit_message>
Cambio en archivos para reunión 3 con la super, se agrega carpeta y archivos para comité de ética
</commit_message>
<xml_diff>
--- a/documentos/Validación Matriz/Documentos_Validacion_Matriz_2025/04_Proceso_Pension/09_Proceso_Solicitud.docx
+++ b/documentos/Validación Matriz/Documentos_Validacion_Matriz_2025/04_Proceso_Pension/09_Proceso_Solicitud.docx
@@ -32,6 +32,8 @@
     <w:p>
       <w:pPr>
         <w:rPr>
+          <w:b/>
+          <w:bCs/>
           <w:lang w:val="es-CL"/>
         </w:rPr>
       </w:pPr>
@@ -54,6 +56,72 @@
           <w:lang w:val="es-CL"/>
         </w:rPr>
         <w:t>Qué es Pensión</w:t>
+      </w:r>
+      <w:r>
+        <w:rPr>
+          <w:b/>
+          <w:bCs/>
+          <w:lang w:val="es-CL"/>
+        </w:rPr>
+        <w:br/>
+      </w:r>
+      <w:r>
+        <w:rPr>
+          <w:b/>
+          <w:bCs/>
+          <w:lang w:val="es-CL"/>
+        </w:rPr>
+        <w:tab/>
+      </w:r>
+      <w:r>
+        <w:rPr>
+          <w:b/>
+          <w:bCs/>
+          <w:lang w:val="es-CL"/>
+        </w:rPr>
+        <w:tab/>
+      </w:r>
+      <w:r>
+        <w:rPr>
+          <w:b/>
+          <w:bCs/>
+          <w:lang w:val="es-CL"/>
+        </w:rPr>
+        <w:tab/>
+        <w:t>Jubilación</w:t>
+      </w:r>
+      <w:r>
+        <w:rPr>
+          <w:b/>
+          <w:bCs/>
+          <w:lang w:val="es-CL"/>
+        </w:rPr>
+        <w:br/>
+      </w:r>
+      <w:r>
+        <w:rPr>
+          <w:b/>
+          <w:bCs/>
+          <w:lang w:val="es-CL"/>
+        </w:rPr>
+        <w:tab/>
+      </w:r>
+      <w:r>
+        <w:rPr>
+          <w:b/>
+          <w:bCs/>
+          <w:lang w:val="es-CL"/>
+        </w:rPr>
+        <w:tab/>
+      </w:r>
+      <w:r>
+        <w:rPr>
+          <w:b/>
+          <w:bCs/>
+          <w:lang w:val="es-CL"/>
+        </w:rPr>
+        <w:tab/>
+        <w:t>Cotizaciones Previsionales</w:t>
       </w:r>
       <w:r>
         <w:rPr>

</xml_diff>